<commit_message>
Wordly Customer Success Associate: score 74 after confirmations; profile adds GMT hours, Zendesk ticket queue, entry-level pay
Co-Authored-By: Claude Opus 5.5 <noreply@anthropic.com>
Claude-Session: https://claude.ai/code/session_018DEej5NGjq1omj9BTtvEiy
</commit_message>
<xml_diff>
--- a/applications/wordly-customer-success-associate/Wordly-CustomerSuccessAssociate-Resume.docx
+++ b/applications/wordly-customer-success-associate/Wordly-CustomerSuccessAssociate-Resume.docx
@@ -80,7 +80,7 @@
           <w:i w:val="0"/>
           <w:color w:val="1A1A1A"/>
         </w:rPr>
-        <w:t>Detail-focused customer success and operations professional who works hands-on with AI systems and the data behind them. At Solenzo I configure and evaluate AI-generated output, built rubric-based grading criteria for an audit process, and do the underlying data labeling myself. I've cleaned a 1,400+ contact CRM, validate every data import, and write working SQL. 15+ years helping SaaS customers get set up and supported, including a 50+ activities-per-day partner desk at Birdeye.</w:t>
+        <w:t>Detail-focused customer success and operations professional who works hands-on with AI systems and the data behind them. At Solenzo I configure and evaluate AI-generated output, built rubric-based grading criteria for an audit process, and do the underlying data labeling myself. I've cleaned a 1,400+ contact CRM, validate every data import, and write working SQL. 15+ years helping SaaS customers get set up and supported, including a 50+ activities-per-day partner desk at Birdeye and hands-on support-ticket triage in Zendesk.</w:t>
       </w:r>
     </w:p>
     <w:p>
@@ -620,7 +620,7 @@
           <w:i w:val="0"/>
           <w:color w:val="1A1A1A"/>
         </w:rPr>
-        <w:t>Customer Issue Triage &amp; Resolution, Technical Setup Guidance, Knowledge Base Use, Zendesk, Best-Practice Consultation</w:t>
+        <w:t>Support Ticket Triage &amp; Resolution (Zendesk), Technical Setup Guidance, Knowledge Base Answers, Best-Practice Consultation</w:t>
       </w:r>
     </w:p>
     <w:p>

</xml_diff>